<commit_message>
Restore report cover formatting
</commit_message>
<xml_diff>
--- a/report/202583230025-刘文羽-中文文本分类课程报告.docx
+++ b/report/202583230025-刘文羽-中文文本分类课程报告.docx
@@ -4,13 +4,22 @@
   <w:body>
     <w:p>
       <w:pPr>
-        <w:rPr>
+        <w:spacing w:before="50" w:after="0"/>
+        <w:jc w:val="center"/>
+        <w:rPr>
+          <w:rFonts w:eastAsia="黑体"/>
+          <w:b/>
+          <w:color w:val="000000"/>
+          <w:sz w:val="96"/>
           <w:lang w:eastAsia="zh-CN"/>
         </w:rPr>
       </w:pPr>
       <w:r>
         <w:rPr>
-          <w:rFonts w:hint="eastAsia"/>
+          <w:rFonts w:eastAsia="黑体" w:hint="eastAsia"/>
+          <w:b/>
+          <w:color w:val="000000"/>
+          <w:sz w:val="96"/>
           <w:lang w:eastAsia="zh-CN"/>
         </w:rPr>
         <w:t>自然语言处理</w:t>
@@ -18,13 +27,22 @@
     </w:p>
     <w:p>
       <w:pPr>
-        <w:rPr>
+        <w:spacing w:before="50" w:after="0"/>
+        <w:jc w:val="center"/>
+        <w:rPr>
+          <w:rFonts w:eastAsia="黑体"/>
+          <w:b/>
+          <w:color w:val="000000"/>
+          <w:sz w:val="96"/>
           <w:lang w:eastAsia="zh-CN"/>
         </w:rPr>
       </w:pPr>
       <w:r>
         <w:rPr>
-          <w:rFonts w:hint="eastAsia"/>
+          <w:rFonts w:eastAsia="黑体" w:hint="eastAsia"/>
+          <w:b/>
+          <w:color w:val="000000"/>
+          <w:sz w:val="96"/>
           <w:lang w:eastAsia="zh-CN"/>
         </w:rPr>
         <w:t>大作业</w:t>
@@ -130,20 +148,26 @@
     </w:p>
     <w:p>
       <w:pPr>
-        <w:rPr>
+        <w:spacing w:after="0"/>
+        <w:ind w:firstLine="1600"/>
+        <w:rPr>
+          <w:color w:val="000000"/>
+          <w:sz w:val="32"/>
           <w:lang w:eastAsia="zh-CN"/>
         </w:rPr>
       </w:pPr>
       <w:r>
         <w:rPr>
-          <w:b/>
+          <w:color w:val="000000"/>
+          <w:sz w:val="32"/>
           <w:lang w:eastAsia="zh-CN"/>
         </w:rPr>
         <w:tab/>
       </w:r>
       <w:r>
         <w:rPr>
-          <w:b/>
+          <w:color w:val="000000"/>
+          <w:sz w:val="32"/>
           <w:lang w:eastAsia="zh-CN"/>
         </w:rPr>
         <w:tab/>
@@ -151,7 +175,8 @@
       <w:r>
         <w:rPr>
           <w:rFonts w:hint="eastAsia"/>
-          <w:b/>
+          <w:color w:val="000000"/>
+          <w:sz w:val="32"/>
           <w:lang w:eastAsia="zh-CN"/>
         </w:rPr>
         <w:t xml:space="preserve">  </w:t>
@@ -159,7 +184,8 @@
       <w:r>
         <w:rPr>
           <w:rFonts w:hint="eastAsia"/>
-          <w:b/>
+          <w:color w:val="000000"/>
+          <w:sz w:val="32"/>
           <w:lang w:eastAsia="zh-CN"/>
         </w:rPr>
         <w:t>学</w:t>
@@ -167,7 +193,8 @@
       <w:r>
         <w:rPr>
           <w:rFonts w:hint="eastAsia"/>
-          <w:b/>
+          <w:color w:val="000000"/>
+          <w:sz w:val="32"/>
           <w:lang w:eastAsia="zh-CN"/>
         </w:rPr>
         <w:t xml:space="preserve">     </w:t>
@@ -175,7 +202,8 @@
       <w:r>
         <w:rPr>
           <w:rFonts w:hint="eastAsia"/>
-          <w:b/>
+          <w:color w:val="000000"/>
+          <w:sz w:val="32"/>
           <w:lang w:eastAsia="zh-CN"/>
         </w:rPr>
         <w:t xml:space="preserve">  </w:t>
@@ -183,7 +211,8 @@
       <w:r>
         <w:rPr>
           <w:rFonts w:hint="eastAsia"/>
-          <w:b/>
+          <w:color w:val="000000"/>
+          <w:sz w:val="32"/>
           <w:lang w:eastAsia="zh-CN"/>
         </w:rPr>
         <w:t xml:space="preserve"> </w:t>
@@ -191,7 +220,8 @@
       <w:r>
         <w:rPr>
           <w:rFonts w:hint="eastAsia"/>
-          <w:b/>
+          <w:color w:val="000000"/>
+          <w:sz w:val="32"/>
           <w:lang w:eastAsia="zh-CN"/>
         </w:rPr>
         <w:t>院</w:t>
@@ -199,7 +229,8 @@
       <w:r>
         <w:rPr>
           <w:rFonts w:hint="eastAsia"/>
-          <w:sz w:val="36"/>
+          <w:color w:val="000000"/>
+          <w:sz w:val="32"/>
           <w:szCs w:val="36"/>
           <w:lang w:eastAsia="zh-CN"/>
         </w:rPr>
@@ -208,6 +239,8 @@
       <w:r>
         <w:rPr>
           <w:rFonts w:hint="eastAsia"/>
+          <w:color w:val="000000"/>
+          <w:sz w:val="32"/>
           <w:lang w:eastAsia="zh-CN"/>
         </w:rPr>
         <w:t xml:space="preserve">     </w:t>
@@ -215,6 +248,8 @@
       <w:r>
         <w:rPr>
           <w:rFonts w:hint="eastAsia"/>
+          <w:color w:val="000000"/>
+          <w:sz w:val="32"/>
           <w:lang w:eastAsia="zh-CN"/>
         </w:rPr>
         <w:t>智</w:t>
@@ -222,6 +257,8 @@
       <w:r>
         <w:rPr>
           <w:rFonts w:hint="eastAsia"/>
+          <w:color w:val="000000"/>
+          <w:sz w:val="32"/>
           <w:lang w:eastAsia="zh-CN"/>
         </w:rPr>
         <w:t>能装备学院</w:t>
@@ -229,6 +266,8 @@
       <w:r>
         <w:rPr>
           <w:rFonts w:hint="eastAsia"/>
+          <w:color w:val="000000"/>
+          <w:sz w:val="32"/>
           <w:lang w:eastAsia="zh-CN"/>
         </w:rPr>
         <w:t xml:space="preserve">   </w:t>
@@ -236,6 +275,8 @@
       <w:r>
         <w:rPr>
           <w:rFonts w:hint="eastAsia"/>
+          <w:color w:val="000000"/>
+          <w:sz w:val="32"/>
           <w:lang w:eastAsia="zh-CN"/>
         </w:rPr>
         <w:t xml:space="preserve"> </w:t>
@@ -243,6 +284,8 @@
       <w:r>
         <w:rPr>
           <w:rFonts w:hint="eastAsia"/>
+          <w:color w:val="000000"/>
+          <w:sz w:val="32"/>
           <w:lang w:eastAsia="zh-CN"/>
         </w:rPr>
         <w:t xml:space="preserve"> </w:t>
@@ -250,14 +293,19 @@
     </w:p>
     <w:p>
       <w:pPr>
-        <w:rPr>
+        <w:spacing w:after="0"/>
+        <w:ind w:firstLine="1600"/>
+        <w:rPr>
+          <w:color w:val="000000"/>
+          <w:sz w:val="32"/>
           <w:lang w:eastAsia="zh-CN"/>
         </w:rPr>
       </w:pPr>
       <w:r>
         <w:rPr>
           <w:rFonts w:hint="eastAsia"/>
-          <w:b/>
+          <w:color w:val="000000"/>
+          <w:sz w:val="32"/>
           <w:lang w:eastAsia="zh-CN"/>
         </w:rPr>
         <w:t>班</w:t>
@@ -265,7 +313,8 @@
       <w:r>
         <w:rPr>
           <w:rFonts w:hint="eastAsia"/>
-          <w:b/>
+          <w:color w:val="000000"/>
+          <w:sz w:val="32"/>
           <w:lang w:eastAsia="zh-CN"/>
         </w:rPr>
         <w:t xml:space="preserve">   </w:t>
@@ -273,7 +322,8 @@
       <w:r>
         <w:rPr>
           <w:rFonts w:hint="eastAsia"/>
-          <w:b/>
+          <w:color w:val="000000"/>
+          <w:sz w:val="32"/>
           <w:lang w:eastAsia="zh-CN"/>
         </w:rPr>
         <w:t xml:space="preserve"> </w:t>
@@ -281,7 +331,8 @@
       <w:r>
         <w:rPr>
           <w:rFonts w:hint="eastAsia"/>
-          <w:b/>
+          <w:color w:val="000000"/>
+          <w:sz w:val="32"/>
           <w:lang w:eastAsia="zh-CN"/>
         </w:rPr>
         <w:t xml:space="preserve">  </w:t>
@@ -289,7 +340,8 @@
       <w:r>
         <w:rPr>
           <w:rFonts w:hint="eastAsia"/>
-          <w:b/>
+          <w:color w:val="000000"/>
+          <w:sz w:val="32"/>
           <w:lang w:eastAsia="zh-CN"/>
         </w:rPr>
         <w:t xml:space="preserve"> </w:t>
@@ -297,7 +349,8 @@
       <w:r>
         <w:rPr>
           <w:rFonts w:hint="eastAsia"/>
-          <w:b/>
+          <w:color w:val="000000"/>
+          <w:sz w:val="32"/>
           <w:lang w:eastAsia="zh-CN"/>
         </w:rPr>
         <w:t xml:space="preserve"> </w:t>
@@ -305,7 +358,8 @@
       <w:r>
         <w:rPr>
           <w:rFonts w:hint="eastAsia"/>
-          <w:b/>
+          <w:color w:val="000000"/>
+          <w:sz w:val="32"/>
           <w:lang w:eastAsia="zh-CN"/>
         </w:rPr>
         <w:t>级</w:t>
@@ -313,7 +367,8 @@
       <w:r>
         <w:rPr>
           <w:rFonts w:hint="eastAsia"/>
-          <w:sz w:val="36"/>
+          <w:color w:val="000000"/>
+          <w:sz w:val="32"/>
           <w:szCs w:val="36"/>
           <w:lang w:eastAsia="zh-CN"/>
         </w:rPr>
@@ -322,6 +377,8 @@
       <w:r>
         <w:rPr>
           <w:rFonts w:hint="eastAsia"/>
+          <w:color w:val="000000"/>
+          <w:sz w:val="32"/>
           <w:lang w:eastAsia="zh-CN"/>
         </w:rPr>
         <w:t xml:space="preserve"> </w:t>
@@ -329,6 +386,8 @@
       <w:r>
         <w:rPr>
           <w:rFonts w:hint="eastAsia"/>
+          <w:color w:val="000000"/>
+          <w:sz w:val="32"/>
           <w:lang w:eastAsia="zh-CN"/>
         </w:rPr>
         <w:t xml:space="preserve">        </w:t>
@@ -336,6 +395,8 @@
       <w:r>
         <w:rPr>
           <w:rFonts w:hint="eastAsia"/>
+          <w:color w:val="000000"/>
+          <w:sz w:val="32"/>
           <w:lang w:eastAsia="zh-CN"/>
         </w:rPr>
         <w:t>硕研</w:t>
@@ -343,6 +404,8 @@
       <w:r>
         <w:rPr>
           <w:rFonts w:hint="eastAsia"/>
+          <w:color w:val="000000"/>
+          <w:sz w:val="32"/>
           <w:lang w:eastAsia="zh-CN"/>
         </w:rPr>
         <w:t>25-2</w:t>
@@ -350,6 +413,8 @@
       <w:r>
         <w:rPr>
           <w:rFonts w:hint="eastAsia"/>
+          <w:color w:val="000000"/>
+          <w:sz w:val="32"/>
           <w:lang w:eastAsia="zh-CN"/>
         </w:rPr>
         <w:t xml:space="preserve">      </w:t>
@@ -357,6 +422,8 @@
       <w:r>
         <w:rPr>
           <w:rFonts w:hint="eastAsia"/>
+          <w:color w:val="000000"/>
+          <w:sz w:val="32"/>
           <w:lang w:eastAsia="zh-CN"/>
         </w:rPr>
         <w:t xml:space="preserve"> </w:t>
@@ -364,6 +431,8 @@
       <w:r>
         <w:rPr>
           <w:rFonts w:hint="eastAsia"/>
+          <w:color w:val="000000"/>
+          <w:sz w:val="32"/>
           <w:lang w:eastAsia="zh-CN"/>
         </w:rPr>
         <w:t xml:space="preserve">  </w:t>
@@ -371,21 +440,27 @@
     </w:p>
     <w:p>
       <w:pPr>
-        <w:rPr>
+        <w:spacing w:after="0"/>
+        <w:ind w:firstLine="1600"/>
+        <w:rPr>
+          <w:color w:val="000000"/>
+          <w:sz w:val="32"/>
           <w:lang w:eastAsia="zh-CN"/>
         </w:rPr>
       </w:pPr>
       <w:r>
         <w:rPr>
           <w:rFonts w:hint="eastAsia"/>
-          <w:b/>
+          <w:color w:val="000000"/>
+          <w:sz w:val="32"/>
           <w:lang w:eastAsia="zh-CN"/>
         </w:rPr>
         <w:t>姓</w:t>
       </w:r>
       <w:r>
         <w:rPr>
-          <w:b/>
+          <w:color w:val="000000"/>
+          <w:sz w:val="32"/>
           <w:lang w:eastAsia="zh-CN"/>
         </w:rPr>
         <w:t xml:space="preserve">  </w:t>
@@ -393,14 +468,16 @@
       <w:r>
         <w:rPr>
           <w:rFonts w:hint="eastAsia"/>
-          <w:b/>
+          <w:color w:val="000000"/>
+          <w:sz w:val="32"/>
           <w:lang w:eastAsia="zh-CN"/>
         </w:rPr>
         <w:t xml:space="preserve">  </w:t>
       </w:r>
       <w:r>
         <w:rPr>
-          <w:b/>
+          <w:color w:val="000000"/>
+          <w:sz w:val="32"/>
           <w:lang w:eastAsia="zh-CN"/>
         </w:rPr>
         <w:t xml:space="preserve"> </w:t>
@@ -408,14 +485,16 @@
       <w:r>
         <w:rPr>
           <w:rFonts w:hint="eastAsia"/>
-          <w:b/>
+          <w:color w:val="000000"/>
+          <w:sz w:val="32"/>
           <w:lang w:eastAsia="zh-CN"/>
         </w:rPr>
         <w:t xml:space="preserve">  </w:t>
       </w:r>
       <w:r>
         <w:rPr>
-          <w:b/>
+          <w:color w:val="000000"/>
+          <w:sz w:val="32"/>
           <w:lang w:eastAsia="zh-CN"/>
         </w:rPr>
         <w:t xml:space="preserve"> </w:t>
@@ -423,7 +502,8 @@
       <w:r>
         <w:rPr>
           <w:rFonts w:hint="eastAsia"/>
-          <w:b/>
+          <w:color w:val="000000"/>
+          <w:sz w:val="32"/>
           <w:lang w:eastAsia="zh-CN"/>
         </w:rPr>
         <w:t>名：</w:t>
@@ -431,12 +511,16 @@
       <w:r>
         <w:rPr>
           <w:rFonts w:hint="eastAsia"/>
+          <w:color w:val="000000"/>
+          <w:sz w:val="32"/>
           <w:lang w:eastAsia="zh-CN"/>
         </w:rPr>
         <w:t xml:space="preserve">      </w:t>
       </w:r>
       <w:r>
         <w:rPr>
+          <w:color w:val="000000"/>
+          <w:sz w:val="32"/>
           <w:lang w:eastAsia="zh-CN"/>
         </w:rPr>
         <w:t xml:space="preserve">      </w:t>
@@ -444,6 +528,8 @@
       <w:r>
         <w:rPr>
           <w:rFonts w:hint="eastAsia"/>
+          <w:color w:val="000000"/>
+          <w:sz w:val="32"/>
           <w:lang w:eastAsia="zh-CN"/>
         </w:rPr>
         <w:t>刘文羽</w:t>
@@ -451,6 +537,8 @@
       <w:r>
         <w:rPr>
           <w:rFonts w:hint="eastAsia"/>
+          <w:color w:val="000000"/>
+          <w:sz w:val="32"/>
           <w:lang w:eastAsia="zh-CN"/>
         </w:rPr>
         <w:t xml:space="preserve">     </w:t>
@@ -458,6 +546,8 @@
       <w:r>
         <w:rPr>
           <w:rFonts w:hint="eastAsia"/>
+          <w:color w:val="000000"/>
+          <w:sz w:val="32"/>
           <w:lang w:eastAsia="zh-CN"/>
         </w:rPr>
         <w:t xml:space="preserve"> </w:t>
@@ -465,6 +555,8 @@
       <w:r>
         <w:rPr>
           <w:rFonts w:hint="eastAsia"/>
+          <w:color w:val="000000"/>
+          <w:sz w:val="32"/>
           <w:lang w:eastAsia="zh-CN"/>
         </w:rPr>
         <w:t xml:space="preserve"> </w:t>
@@ -472,6 +564,8 @@
       <w:r>
         <w:rPr>
           <w:rFonts w:hint="eastAsia"/>
+          <w:color w:val="000000"/>
+          <w:sz w:val="32"/>
           <w:lang w:eastAsia="zh-CN"/>
         </w:rPr>
         <w:t xml:space="preserve"> </w:t>
@@ -479,6 +573,8 @@
       <w:r>
         <w:rPr>
           <w:rFonts w:hint="eastAsia"/>
+          <w:color w:val="000000"/>
+          <w:sz w:val="32"/>
           <w:lang w:eastAsia="zh-CN"/>
         </w:rPr>
         <w:t xml:space="preserve"> </w:t>
@@ -486,6 +582,8 @@
       <w:r>
         <w:rPr>
           <w:rFonts w:hint="eastAsia"/>
+          <w:color w:val="000000"/>
+          <w:sz w:val="32"/>
           <w:lang w:eastAsia="zh-CN"/>
         </w:rPr>
         <w:t xml:space="preserve">  </w:t>
@@ -493,76 +591,81 @@
     </w:p>
     <w:p>
       <w:pPr>
-        <w:rPr>
+        <w:spacing w:after="0"/>
+        <w:ind w:firstLine="1600"/>
+        <w:rPr>
+          <w:color w:val="000000"/>
+          <w:sz w:val="32"/>
           <w:u w:val="single"/>
           <w:lang w:eastAsia="zh-CN"/>
         </w:rPr>
       </w:pPr>
       <w:r>
         <w:rPr>
-          <w:rFonts w:eastAsia="黑体" w:hint="eastAsia"/>
-          <w:b/>
+          <w:rFonts w:hint="eastAsia"/>
+          <w:color w:val="000000"/>
+          <w:sz w:val="32"/>
           <w:lang w:eastAsia="zh-CN"/>
         </w:rPr>
         <w:t>学</w:t>
       </w:r>
       <w:r>
         <w:rPr>
-          <w:rFonts w:eastAsia="黑体"/>
-          <w:b/>
+          <w:color w:val="000000"/>
+          <w:sz w:val="32"/>
           <w:lang w:eastAsia="zh-CN"/>
         </w:rPr>
         <w:t xml:space="preserve">   </w:t>
       </w:r>
       <w:r>
         <w:rPr>
-          <w:rFonts w:eastAsia="黑体" w:hint="eastAsia"/>
-          <w:b/>
+          <w:rFonts w:hint="eastAsia"/>
+          <w:color w:val="000000"/>
+          <w:sz w:val="32"/>
           <w:lang w:eastAsia="zh-CN"/>
         </w:rPr>
         <w:t xml:space="preserve">  </w:t>
       </w:r>
       <w:r>
         <w:rPr>
-          <w:rFonts w:eastAsia="黑体"/>
-          <w:b/>
+          <w:color w:val="000000"/>
+          <w:sz w:val="32"/>
           <w:lang w:eastAsia="zh-CN"/>
         </w:rPr>
         <w:t xml:space="preserve"> </w:t>
       </w:r>
       <w:r>
         <w:rPr>
-          <w:rFonts w:eastAsia="黑体" w:hint="eastAsia"/>
-          <w:b/>
+          <w:rFonts w:hint="eastAsia"/>
+          <w:color w:val="000000"/>
+          <w:sz w:val="32"/>
           <w:lang w:eastAsia="zh-CN"/>
         </w:rPr>
         <w:t xml:space="preserve">  </w:t>
       </w:r>
       <w:r>
         <w:rPr>
-          <w:rFonts w:eastAsia="黑体" w:hint="eastAsia"/>
-          <w:b/>
+          <w:rFonts w:hint="eastAsia"/>
+          <w:color w:val="000000"/>
+          <w:sz w:val="32"/>
           <w:lang w:eastAsia="zh-CN"/>
         </w:rPr>
         <w:t>号：</w:t>
       </w:r>
       <w:r>
         <w:rPr>
-          <w:rFonts w:eastAsia="黑体" w:hint="eastAsia"/>
-          <w:lang w:eastAsia="zh-CN"/>
-        </w:rPr>
-        <w:t xml:space="preserve">    </w:t>
-      </w:r>
-      <w:r>
-        <w:rPr>
           <w:rFonts w:hint="eastAsia"/>
-          <w:lang w:eastAsia="zh-CN"/>
-        </w:rPr>
-        <w:t>2025832300258</w:t>
+          <w:color w:val="000000"/>
+          <w:sz w:val="32"/>
+          <w:lang w:eastAsia="zh-CN"/>
+        </w:rPr>
+        <w:t xml:space="preserve">    2025832300258</w:t>
       </w:r>
       <w:r>
         <w:rPr>
           <w:rFonts w:hint="eastAsia"/>
+          <w:color w:val="000000"/>
+          <w:sz w:val="32"/>
           <w:lang w:eastAsia="zh-CN"/>
         </w:rPr>
         <w:t xml:space="preserve"> </w:t>
@@ -570,6 +673,8 @@
       <w:r>
         <w:rPr>
           <w:rFonts w:hint="eastAsia"/>
+          <w:color w:val="000000"/>
+          <w:sz w:val="32"/>
           <w:lang w:eastAsia="zh-CN"/>
         </w:rPr>
         <w:t xml:space="preserve"> </w:t>
@@ -577,6 +682,8 @@
       <w:r>
         <w:rPr>
           <w:rFonts w:hint="eastAsia"/>
+          <w:color w:val="000000"/>
+          <w:sz w:val="32"/>
           <w:lang w:eastAsia="zh-CN"/>
         </w:rPr>
         <w:t xml:space="preserve"> </w:t>
@@ -584,6 +691,8 @@
       <w:r>
         <w:rPr>
           <w:rFonts w:hint="eastAsia"/>
+          <w:color w:val="000000"/>
+          <w:sz w:val="32"/>
           <w:lang w:eastAsia="zh-CN"/>
         </w:rPr>
         <w:t xml:space="preserve"> </w:t>
@@ -591,6 +700,8 @@
       <w:r>
         <w:rPr>
           <w:rFonts w:hint="eastAsia"/>
+          <w:color w:val="000000"/>
+          <w:sz w:val="32"/>
           <w:lang w:eastAsia="zh-CN"/>
         </w:rPr>
         <w:t xml:space="preserve"> </w:t>
@@ -598,7 +709,11 @@
     </w:p>
     <w:p>
       <w:pPr>
-        <w:rPr>
+        <w:spacing w:after="0"/>
+        <w:ind w:firstLine="1600"/>
+        <w:rPr>
+          <w:color w:val="000000"/>
+          <w:sz w:val="32"/>
           <w:u w:val="single"/>
           <w:lang w:eastAsia="zh-CN"/>
         </w:rPr>
@@ -606,7 +721,8 @@
       <w:r>
         <w:rPr>
           <w:rFonts w:hint="eastAsia"/>
-          <w:b/>
+          <w:color w:val="000000"/>
+          <w:sz w:val="32"/>
           <w:lang w:eastAsia="zh-CN"/>
         </w:rPr>
         <w:t>完成日期：</w:t>
@@ -614,6 +730,8 @@
       <w:r>
         <w:rPr>
           <w:rFonts w:hint="eastAsia"/>
+          <w:color w:val="000000"/>
+          <w:sz w:val="32"/>
           <w:lang w:eastAsia="zh-CN"/>
         </w:rPr>
         <w:t xml:space="preserve">  2026</w:t>
@@ -621,6 +739,8 @@
       <w:r>
         <w:rPr>
           <w:rFonts w:hint="eastAsia"/>
+          <w:color w:val="000000"/>
+          <w:sz w:val="32"/>
           <w:lang w:eastAsia="zh-CN"/>
         </w:rPr>
         <w:t>年</w:t>
@@ -628,6 +748,8 @@
       <w:r>
         <w:rPr>
           <w:rFonts w:hint="eastAsia"/>
+          <w:color w:val="000000"/>
+          <w:sz w:val="32"/>
           <w:lang w:eastAsia="zh-CN"/>
         </w:rPr>
         <w:t>6</w:t>
@@ -635,6 +757,8 @@
       <w:r>
         <w:rPr>
           <w:rFonts w:hint="eastAsia"/>
+          <w:color w:val="000000"/>
+          <w:sz w:val="32"/>
           <w:lang w:eastAsia="zh-CN"/>
         </w:rPr>
         <w:t>月</w:t>
@@ -642,6 +766,8 @@
       <w:r>
         <w:rPr>
           <w:rFonts w:hint="eastAsia"/>
+          <w:color w:val="000000"/>
+          <w:sz w:val="32"/>
           <w:lang w:eastAsia="zh-CN"/>
         </w:rPr>
         <w:t>29</w:t>
@@ -649,6 +775,8 @@
       <w:r>
         <w:rPr>
           <w:rFonts w:hint="eastAsia"/>
+          <w:color w:val="000000"/>
+          <w:sz w:val="32"/>
           <w:lang w:eastAsia="zh-CN"/>
         </w:rPr>
         <w:t>日</w:t>
@@ -656,6 +784,8 @@
       <w:r>
         <w:rPr>
           <w:rFonts w:hint="eastAsia"/>
+          <w:color w:val="000000"/>
+          <w:sz w:val="32"/>
           <w:lang w:eastAsia="zh-CN"/>
         </w:rPr>
         <w:t xml:space="preserve">  </w:t>
@@ -705,15 +835,24 @@
     </w:p>
     <w:p>
       <w:pPr>
-        <w:rPr>
+        <w:spacing w:after="0"/>
+        <w:jc w:val="center"/>
+        <w:rPr>
+          <w:rFonts w:eastAsia="黑体"/>
+          <w:b/>
           <w:bCs/>
+          <w:color w:val="000000"/>
           <w:spacing w:val="40"/>
+          <w:sz w:val="36"/>
           <w:lang w:eastAsia="zh-CN"/>
         </w:rPr>
       </w:pPr>
       <w:r>
         <w:rPr>
-          <w:rFonts w:hint="eastAsia"/>
+          <w:rFonts w:eastAsia="黑体" w:hint="eastAsia"/>
+          <w:b/>
+          <w:color w:val="000000"/>
+          <w:sz w:val="36"/>
           <w:lang w:eastAsia="zh-CN"/>
         </w:rPr>
         <w:t>山东科技大学</w:t>
@@ -728,24 +867,42 @@
     </w:p>
     <w:p>
       <w:pPr>
-        <w:rPr>
+        <w:spacing w:after="240"/>
+        <w:jc w:val="center"/>
+        <w:rPr>
+          <w:rFonts w:eastAsia="黑体"/>
+          <w:b/>
+          <w:color w:val="000000"/>
+          <w:sz w:val="36"/>
           <w:lang w:eastAsia="zh-CN"/>
         </w:rPr>
       </w:pPr>
       <w:r>
         <w:rPr>
+          <w:rFonts w:eastAsia="黑体"/>
+          <w:b/>
+          <w:color w:val="000000"/>
+          <w:sz w:val="36"/>
           <w:lang w:eastAsia="zh-CN"/>
         </w:rPr>
         <w:t>摘</w:t>
       </w:r>
       <w:r>
         <w:rPr>
+          <w:rFonts w:eastAsia="黑体"/>
+          <w:b/>
+          <w:color w:val="000000"/>
+          <w:sz w:val="36"/>
           <w:lang w:eastAsia="zh-CN"/>
         </w:rPr>
         <w:t xml:space="preserve">  </w:t>
       </w:r>
       <w:r>
         <w:rPr>
+          <w:rFonts w:eastAsia="黑体"/>
+          <w:b/>
+          <w:color w:val="000000"/>
+          <w:sz w:val="36"/>
           <w:lang w:eastAsia="zh-CN"/>
         </w:rPr>
         <w:t>要</w:t>
@@ -980,12 +1137,22 @@
     </w:p>
     <w:p>
       <w:pPr>
-        <w:rPr>
+        <w:spacing w:after="240"/>
+        <w:jc w:val="center"/>
+        <w:rPr>
+          <w:rFonts w:eastAsia="黑体"/>
+          <w:b/>
+          <w:color w:val="000000"/>
+          <w:sz w:val="36"/>
           <w:lang w:eastAsia="zh-CN"/>
         </w:rPr>
       </w:pPr>
       <w:r>
         <w:rPr>
+          <w:rFonts w:eastAsia="黑体"/>
+          <w:b/>
+          <w:color w:val="000000"/>
+          <w:sz w:val="36"/>
           <w:lang w:eastAsia="zh-CN"/>
         </w:rPr>
         <w:lastRenderedPageBreak/>
@@ -993,12 +1160,20 @@
       </w:r>
       <w:r>
         <w:rPr>
+          <w:rFonts w:eastAsia="黑体"/>
+          <w:b/>
+          <w:color w:val="000000"/>
+          <w:sz w:val="36"/>
           <w:lang w:eastAsia="zh-CN"/>
         </w:rPr>
         <w:t xml:space="preserve">  </w:t>
       </w:r>
       <w:r>
         <w:rPr>
+          <w:rFonts w:eastAsia="黑体"/>
+          <w:b/>
+          <w:color w:val="000000"/>
+          <w:sz w:val="36"/>
           <w:lang w:eastAsia="zh-CN"/>
         </w:rPr>
         <w:t>录</w:t>
@@ -1039,7 +1214,7 @@
         </w:rPr>
         <w:fldChar w:fldCharType="separate"/>
       </w:r>
-      <w:hyperlink w:anchor="_Toc233969204" w:history="1">
+      <w:hyperlink w:anchor="_Toc233969469" w:history="1">
         <w:r>
           <w:rPr>
             <w:rStyle w:val="affb"/>
@@ -1087,7 +1262,7 @@
             <w:noProof/>
             <w:webHidden/>
           </w:rPr>
-          <w:instrText>PAGEREF _Toc233969204 \h</w:instrText>
+          <w:instrText>PAGEREF _Toc233969469 \h</w:instrText>
         </w:r>
         <w:r>
           <w:rPr>
@@ -1145,7 +1320,7 @@
           <w14:ligatures w14:val="standardContextual"/>
         </w:rPr>
       </w:pPr>
-      <w:hyperlink w:anchor="_Toc233969205" w:history="1">
+      <w:hyperlink w:anchor="_Toc233969470" w:history="1">
         <w:r>
           <w:rPr>
             <w:rStyle w:val="affb"/>
@@ -1193,7 +1368,7 @@
             <w:noProof/>
             <w:webHidden/>
           </w:rPr>
-          <w:instrText>PAGEREF _Toc233969205 \h</w:instrText>
+          <w:instrText>PAGEREF _Toc233969470 \h</w:instrText>
         </w:r>
         <w:r>
           <w:rPr>
@@ -1251,7 +1426,7 @@
           <w14:ligatures w14:val="standardContextual"/>
         </w:rPr>
       </w:pPr>
-      <w:hyperlink w:anchor="_Toc233969206" w:history="1">
+      <w:hyperlink w:anchor="_Toc233969471" w:history="1">
         <w:r>
           <w:rPr>
             <w:rStyle w:val="affb"/>
@@ -1299,7 +1474,7 @@
             <w:noProof/>
             <w:webHidden/>
           </w:rPr>
-          <w:instrText>PAGEREF _Toc233969206 \h</w:instrText>
+          <w:instrText>PAGEREF _Toc233969471 \h</w:instrText>
         </w:r>
         <w:r>
           <w:rPr>
@@ -1356,7 +1531,7 @@
           <w14:ligatures w14:val="standardContextual"/>
         </w:rPr>
       </w:pPr>
-      <w:hyperlink w:anchor="_Toc233969207" w:history="1">
+      <w:hyperlink w:anchor="_Toc233969472" w:history="1">
         <w:r>
           <w:rPr>
             <w:rStyle w:val="affb"/>
@@ -1404,7 +1579,7 @@
             <w:noProof/>
             <w:webHidden/>
           </w:rPr>
-          <w:instrText>PAGEREF _Toc233969207 \h</w:instrText>
+          <w:instrText>PAGEREF _Toc233969472 \h</w:instrText>
         </w:r>
         <w:r>
           <w:rPr>
@@ -1462,7 +1637,7 @@
           <w14:ligatures w14:val="standardContextual"/>
         </w:rPr>
       </w:pPr>
-      <w:hyperlink w:anchor="_Toc233969208" w:history="1">
+      <w:hyperlink w:anchor="_Toc233969473" w:history="1">
         <w:r>
           <w:rPr>
             <w:rStyle w:val="affb"/>
@@ -1510,7 +1685,7 @@
             <w:noProof/>
             <w:webHidden/>
           </w:rPr>
-          <w:instrText>PAGEREF _Toc233969208 \h</w:instrText>
+          <w:instrText>PAGEREF _Toc233969473 \h</w:instrText>
         </w:r>
         <w:r>
           <w:rPr>
@@ -1568,7 +1743,7 @@
           <w14:ligatures w14:val="standardContextual"/>
         </w:rPr>
       </w:pPr>
-      <w:hyperlink w:anchor="_Toc233969209" w:history="1">
+      <w:hyperlink w:anchor="_Toc233969474" w:history="1">
         <w:r>
           <w:rPr>
             <w:rStyle w:val="affb"/>
@@ -1616,7 +1791,7 @@
             <w:noProof/>
             <w:webHidden/>
           </w:rPr>
-          <w:instrText>PAGEREF _Toc233969209 \h</w:instrText>
+          <w:instrText>PAGEREF _Toc233969474 \h</w:instrText>
         </w:r>
         <w:r>
           <w:rPr>
@@ -1673,7 +1848,7 @@
           <w14:ligatures w14:val="standardContextual"/>
         </w:rPr>
       </w:pPr>
-      <w:hyperlink w:anchor="_Toc233969210" w:history="1">
+      <w:hyperlink w:anchor="_Toc233969475" w:history="1">
         <w:r>
           <w:rPr>
             <w:rStyle w:val="affb"/>
@@ -1721,7 +1896,7 @@
             <w:noProof/>
             <w:webHidden/>
           </w:rPr>
-          <w:instrText>PAGEREF _Toc233969210 \h</w:instrText>
+          <w:instrText>PAGEREF _Toc233969475 \h</w:instrText>
         </w:r>
         <w:r>
           <w:rPr>
@@ -1779,7 +1954,7 @@
           <w14:ligatures w14:val="standardContextual"/>
         </w:rPr>
       </w:pPr>
-      <w:hyperlink w:anchor="_Toc233969211" w:history="1">
+      <w:hyperlink w:anchor="_Toc233969476" w:history="1">
         <w:r>
           <w:rPr>
             <w:rStyle w:val="affb"/>
@@ -1827,7 +2002,7 @@
             <w:noProof/>
             <w:webHidden/>
           </w:rPr>
-          <w:instrText>PAGEREF _Toc233969211 \h</w:instrText>
+          <w:instrText>PAGEREF _Toc233969476 \h</w:instrText>
         </w:r>
         <w:r>
           <w:rPr>
@@ -1885,7 +2060,7 @@
           <w14:ligatures w14:val="standardContextual"/>
         </w:rPr>
       </w:pPr>
-      <w:hyperlink w:anchor="_Toc233969212" w:history="1">
+      <w:hyperlink w:anchor="_Toc233969477" w:history="1">
         <w:r>
           <w:rPr>
             <w:rStyle w:val="affb"/>
@@ -1931,7 +2106,7 @@
             <w:noProof/>
             <w:webHidden/>
           </w:rPr>
-          <w:instrText>PAGEREF _Toc233969212 \h</w:instrText>
+          <w:instrText>PAGEREF _Toc233969477 \h</w:instrText>
         </w:r>
         <w:r>
           <w:rPr>
@@ -1989,7 +2164,7 @@
           <w14:ligatures w14:val="standardContextual"/>
         </w:rPr>
       </w:pPr>
-      <w:hyperlink w:anchor="_Toc233969213" w:history="1">
+      <w:hyperlink w:anchor="_Toc233969478" w:history="1">
         <w:r>
           <w:rPr>
             <w:rStyle w:val="affb"/>
@@ -2037,7 +2212,7 @@
             <w:noProof/>
             <w:webHidden/>
           </w:rPr>
-          <w:instrText>PAGEREF _Toc233969213 \h</w:instrText>
+          <w:instrText>PAGEREF _Toc233969478 \h</w:instrText>
         </w:r>
         <w:r>
           <w:rPr>
@@ -2094,7 +2269,7 @@
           <w14:ligatures w14:val="standardContextual"/>
         </w:rPr>
       </w:pPr>
-      <w:hyperlink w:anchor="_Toc233969214" w:history="1">
+      <w:hyperlink w:anchor="_Toc233969479" w:history="1">
         <w:r>
           <w:rPr>
             <w:rStyle w:val="affb"/>
@@ -2142,7 +2317,7 @@
             <w:noProof/>
             <w:webHidden/>
           </w:rPr>
-          <w:instrText>PAGEREF _Toc233969214 \h</w:instrText>
+          <w:instrText>PAGEREF _Toc233969479 \h</w:instrText>
         </w:r>
         <w:r>
           <w:rPr>
@@ -2200,7 +2375,7 @@
           <w14:ligatures w14:val="standardContextual"/>
         </w:rPr>
       </w:pPr>
-      <w:hyperlink w:anchor="_Toc233969215" w:history="1">
+      <w:hyperlink w:anchor="_Toc233969480" w:history="1">
         <w:r>
           <w:rPr>
             <w:rStyle w:val="affb"/>
@@ -2248,7 +2423,7 @@
             <w:noProof/>
             <w:webHidden/>
           </w:rPr>
-          <w:instrText>PAGEREF _Toc233969215 \h</w:instrText>
+          <w:instrText>PAGEREF _Toc233969480 \h</w:instrText>
         </w:r>
         <w:r>
           <w:rPr>
@@ -2306,7 +2481,7 @@
           <w14:ligatures w14:val="standardContextual"/>
         </w:rPr>
       </w:pPr>
-      <w:hyperlink w:anchor="_Toc233969216" w:history="1">
+      <w:hyperlink w:anchor="_Toc233969481" w:history="1">
         <w:r>
           <w:rPr>
             <w:rStyle w:val="affb"/>
@@ -2354,7 +2529,7 @@
             <w:noProof/>
             <w:webHidden/>
           </w:rPr>
-          <w:instrText>PAGEREF _Toc233969216 \h</w:instrText>
+          <w:instrText>PAGEREF _Toc233969481 \h</w:instrText>
         </w:r>
         <w:r>
           <w:rPr>
@@ -2412,7 +2587,7 @@
           <w14:ligatures w14:val="standardContextual"/>
         </w:rPr>
       </w:pPr>
-      <w:hyperlink w:anchor="_Toc233969217" w:history="1">
+      <w:hyperlink w:anchor="_Toc233969482" w:history="1">
         <w:r>
           <w:rPr>
             <w:rStyle w:val="affb"/>
@@ -2460,7 +2635,7 @@
             <w:noProof/>
             <w:webHidden/>
           </w:rPr>
-          <w:instrText>PAGEREF _Toc233969217 \h</w:instrText>
+          <w:instrText>PAGEREF _Toc233969482 \h</w:instrText>
         </w:r>
         <w:r>
           <w:rPr>
@@ -2517,7 +2692,7 @@
           <w14:ligatures w14:val="standardContextual"/>
         </w:rPr>
       </w:pPr>
-      <w:hyperlink w:anchor="_Toc233969218" w:history="1">
+      <w:hyperlink w:anchor="_Toc233969483" w:history="1">
         <w:r>
           <w:rPr>
             <w:rStyle w:val="affb"/>
@@ -2565,7 +2740,7 @@
             <w:noProof/>
             <w:webHidden/>
           </w:rPr>
-          <w:instrText>PAGEREF _Toc233969218 \h</w:instrText>
+          <w:instrText>PAGEREF _Toc233969483 \h</w:instrText>
         </w:r>
         <w:r>
           <w:rPr>
@@ -2623,7 +2798,7 @@
           <w14:ligatures w14:val="standardContextual"/>
         </w:rPr>
       </w:pPr>
-      <w:hyperlink w:anchor="_Toc233969219" w:history="1">
+      <w:hyperlink w:anchor="_Toc233969484" w:history="1">
         <w:r>
           <w:rPr>
             <w:rStyle w:val="affb"/>
@@ -2671,7 +2846,7 @@
             <w:noProof/>
             <w:webHidden/>
           </w:rPr>
-          <w:instrText>PAGEREF _Toc233969219 \h</w:instrText>
+          <w:instrText>PAGEREF _Toc233969484 \h</w:instrText>
         </w:r>
         <w:r>
           <w:rPr>
@@ -2729,7 +2904,7 @@
           <w14:ligatures w14:val="standardContextual"/>
         </w:rPr>
       </w:pPr>
-      <w:hyperlink w:anchor="_Toc233969220" w:history="1">
+      <w:hyperlink w:anchor="_Toc233969485" w:history="1">
         <w:r>
           <w:rPr>
             <w:rStyle w:val="affb"/>
@@ -2777,7 +2952,7 @@
             <w:noProof/>
             <w:webHidden/>
           </w:rPr>
-          <w:instrText>PAGEREF _Toc233969220 \h</w:instrText>
+          <w:instrText>PAGEREF _Toc233969485 \h</w:instrText>
         </w:r>
         <w:r>
           <w:rPr>
@@ -2835,7 +3010,7 @@
           <w14:ligatures w14:val="standardContextual"/>
         </w:rPr>
       </w:pPr>
-      <w:hyperlink w:anchor="_Toc233969221" w:history="1">
+      <w:hyperlink w:anchor="_Toc233969486" w:history="1">
         <w:r>
           <w:rPr>
             <w:rStyle w:val="affb"/>
@@ -2881,7 +3056,7 @@
             <w:noProof/>
             <w:webHidden/>
           </w:rPr>
-          <w:instrText>PAGEREF _Toc233969221 \h</w:instrText>
+          <w:instrText>PAGEREF _Toc233969486 \h</w:instrText>
         </w:r>
         <w:r>
           <w:rPr>
@@ -2938,7 +3113,7 @@
           <w14:ligatures w14:val="standardContextual"/>
         </w:rPr>
       </w:pPr>
-      <w:hyperlink w:anchor="_Toc233969222" w:history="1">
+      <w:hyperlink w:anchor="_Toc233969487" w:history="1">
         <w:r>
           <w:rPr>
             <w:rStyle w:val="affb"/>
@@ -2986,7 +3161,7 @@
             <w:noProof/>
             <w:webHidden/>
           </w:rPr>
-          <w:instrText>PAGEREF _Toc233969222 \h</w:instrText>
+          <w:instrText>PAGEREF _Toc233969487 \h</w:instrText>
         </w:r>
         <w:r>
           <w:rPr>
@@ -3043,7 +3218,7 @@
           <w14:ligatures w14:val="standardContextual"/>
         </w:rPr>
       </w:pPr>
-      <w:hyperlink w:anchor="_Toc233969223" w:history="1">
+      <w:hyperlink w:anchor="_Toc233969488" w:history="1">
         <w:r>
           <w:rPr>
             <w:rStyle w:val="affb"/>
@@ -3081,7 +3256,7 @@
             <w:noProof/>
             <w:webHidden/>
           </w:rPr>
-          <w:instrText>PAGEREF _Toc233969223 \h</w:instrText>
+          <w:instrText>PAGEREF _Toc233969488 \h</w:instrText>
         </w:r>
         <w:r>
           <w:rPr>
@@ -3128,12 +3303,8 @@
           <w:lang w:eastAsia="zh-CN"/>
         </w:rPr>
         <w:sectPr>
-          <w:headerReference w:type="even" r:id="rId8"/>
-          <w:headerReference w:type="default" r:id="rId9"/>
-          <w:footerReference w:type="even" r:id="rId10"/>
-          <w:footerReference w:type="default" r:id="rId11"/>
-          <w:headerReference w:type="first" r:id="rId12"/>
-          <w:footerReference w:type="first" r:id="rId13"/>
+          <w:footerReference w:type="even" r:id="rId8"/>
+          <w:footerReference w:type="default" r:id="rId9"/>
           <w:pgSz w:w="11906" w:h="16838"/>
           <w:pgMar w:top="1440" w:right="1797" w:bottom="1440" w:left="1797" w:header="720" w:footer="720" w:gutter="0"/>
           <w:pgNumType w:start="1"/>
@@ -3157,7 +3328,7 @@
       </w:pPr>
       <w:bookmarkStart w:id="1" w:name="_Toc233968964"/>
       <w:bookmarkStart w:id="2" w:name="_Toc233969115"/>
-      <w:bookmarkStart w:id="3" w:name="_Toc233969204"/>
+      <w:bookmarkStart w:id="3" w:name="_Toc233969469"/>
       <w:r>
         <w:rPr>
           <w:lang w:eastAsia="zh-CN"/>
@@ -3186,7 +3357,7 @@
       <w:bookmarkStart w:id="4" w:name="_Toc233967789"/>
       <w:bookmarkStart w:id="5" w:name="_Toc233968965"/>
       <w:bookmarkStart w:id="6" w:name="_Toc233969116"/>
-      <w:bookmarkStart w:id="7" w:name="_Toc233969205"/>
+      <w:bookmarkStart w:id="7" w:name="_Toc233969470"/>
       <w:r>
         <w:rPr>
           <w:lang w:eastAsia="zh-CN"/>
@@ -3240,7 +3411,7 @@
       <w:bookmarkStart w:id="8" w:name="_Toc233967790"/>
       <w:bookmarkStart w:id="9" w:name="_Toc233968966"/>
       <w:bookmarkStart w:id="10" w:name="_Toc233969117"/>
-      <w:bookmarkStart w:id="11" w:name="_Toc233969206"/>
+      <w:bookmarkStart w:id="11" w:name="_Toc233969471"/>
       <w:r>
         <w:rPr>
           <w:lang w:eastAsia="zh-CN"/>
@@ -3305,7 +3476,7 @@
       <w:bookmarkStart w:id="12" w:name="_Toc233967791"/>
       <w:bookmarkStart w:id="13" w:name="_Toc233968967"/>
       <w:bookmarkStart w:id="14" w:name="_Toc233969118"/>
-      <w:bookmarkStart w:id="15" w:name="_Toc233969207"/>
+      <w:bookmarkStart w:id="15" w:name="_Toc233969472"/>
       <w:r>
         <w:rPr>
           <w:lang w:eastAsia="zh-CN"/>
@@ -3333,7 +3504,7 @@
       <w:bookmarkStart w:id="16" w:name="_Toc233967792"/>
       <w:bookmarkStart w:id="17" w:name="_Toc233968968"/>
       <w:bookmarkStart w:id="18" w:name="_Toc233969119"/>
-      <w:bookmarkStart w:id="19" w:name="_Toc233969208"/>
+      <w:bookmarkStart w:id="19" w:name="_Toc233969473"/>
       <w:r>
         <w:rPr>
           <w:lang w:eastAsia="zh-CN"/>
@@ -3422,7 +3593,7 @@
       <w:bookmarkStart w:id="20" w:name="_Toc233967793"/>
       <w:bookmarkStart w:id="21" w:name="_Toc233968969"/>
       <w:bookmarkStart w:id="22" w:name="_Toc233969120"/>
-      <w:bookmarkStart w:id="23" w:name="_Toc233969209"/>
+      <w:bookmarkStart w:id="23" w:name="_Toc233969474"/>
       <w:r>
         <w:rPr>
           <w:lang w:eastAsia="zh-CN"/>
@@ -3696,7 +3867,7 @@
       <w:bookmarkStart w:id="24" w:name="_Toc233967794"/>
       <w:bookmarkStart w:id="25" w:name="_Toc233968970"/>
       <w:bookmarkStart w:id="26" w:name="_Toc233969121"/>
-      <w:bookmarkStart w:id="27" w:name="_Toc233969210"/>
+      <w:bookmarkStart w:id="27" w:name="_Toc233969475"/>
       <w:r>
         <w:rPr>
           <w:lang w:eastAsia="zh-CN"/>
@@ -3724,7 +3895,7 @@
       <w:bookmarkStart w:id="28" w:name="_Toc233967795"/>
       <w:bookmarkStart w:id="29" w:name="_Toc233968971"/>
       <w:bookmarkStart w:id="30" w:name="_Toc233969122"/>
-      <w:bookmarkStart w:id="31" w:name="_Toc233969211"/>
+      <w:bookmarkStart w:id="31" w:name="_Toc233969476"/>
       <w:r>
         <w:rPr>
           <w:lang w:eastAsia="zh-CN"/>
@@ -3810,7 +3981,7 @@
       <w:bookmarkStart w:id="32" w:name="_Toc233967796"/>
       <w:bookmarkStart w:id="33" w:name="_Toc233968972"/>
       <w:bookmarkStart w:id="34" w:name="_Toc233969123"/>
-      <w:bookmarkStart w:id="35" w:name="_Toc233969212"/>
+      <w:bookmarkStart w:id="35" w:name="_Toc233969477"/>
       <w:r>
         <w:t xml:space="preserve">3.2 FastText </w:t>
       </w:r>
@@ -3894,7 +4065,7 @@
       <w:bookmarkStart w:id="36" w:name="_Toc233967797"/>
       <w:bookmarkStart w:id="37" w:name="_Toc233968973"/>
       <w:bookmarkStart w:id="38" w:name="_Toc233969124"/>
-      <w:bookmarkStart w:id="39" w:name="_Toc233969213"/>
+      <w:bookmarkStart w:id="39" w:name="_Toc233969478"/>
       <w:r>
         <w:rPr>
           <w:lang w:eastAsia="zh-CN"/>
@@ -4007,7 +4178,7 @@
       <w:bookmarkStart w:id="40" w:name="_Toc233967798"/>
       <w:bookmarkStart w:id="41" w:name="_Toc233968974"/>
       <w:bookmarkStart w:id="42" w:name="_Toc233969125"/>
-      <w:bookmarkStart w:id="43" w:name="_Toc233969214"/>
+      <w:bookmarkStart w:id="43" w:name="_Toc233969479"/>
       <w:r>
         <w:rPr>
           <w:lang w:eastAsia="zh-CN"/>
@@ -4035,7 +4206,7 @@
       <w:bookmarkStart w:id="44" w:name="_Toc233967799"/>
       <w:bookmarkStart w:id="45" w:name="_Toc233968975"/>
       <w:bookmarkStart w:id="46" w:name="_Toc233969126"/>
-      <w:bookmarkStart w:id="47" w:name="_Toc233969215"/>
+      <w:bookmarkStart w:id="47" w:name="_Toc233969480"/>
       <w:r>
         <w:rPr>
           <w:lang w:eastAsia="zh-CN"/>
@@ -4241,7 +4412,7 @@
       <w:bookmarkStart w:id="48" w:name="_Toc233967800"/>
       <w:bookmarkStart w:id="49" w:name="_Toc233968976"/>
       <w:bookmarkStart w:id="50" w:name="_Toc233969127"/>
-      <w:bookmarkStart w:id="51" w:name="_Toc233969216"/>
+      <w:bookmarkStart w:id="51" w:name="_Toc233969481"/>
       <w:r>
         <w:rPr>
           <w:lang w:eastAsia="zh-CN"/>
@@ -4342,7 +4513,7 @@
       <w:bookmarkStart w:id="52" w:name="_Toc233967801"/>
       <w:bookmarkStart w:id="53" w:name="_Toc233968977"/>
       <w:bookmarkStart w:id="54" w:name="_Toc233969128"/>
-      <w:bookmarkStart w:id="55" w:name="_Toc233969217"/>
+      <w:bookmarkStart w:id="55" w:name="_Toc233969482"/>
       <w:r>
         <w:rPr>
           <w:lang w:eastAsia="zh-CN"/>
@@ -4527,7 +4698,7 @@
       <w:bookmarkStart w:id="56" w:name="_Toc233967802"/>
       <w:bookmarkStart w:id="57" w:name="_Toc233968978"/>
       <w:bookmarkStart w:id="58" w:name="_Toc233969129"/>
-      <w:bookmarkStart w:id="59" w:name="_Toc233969218"/>
+      <w:bookmarkStart w:id="59" w:name="_Toc233969483"/>
       <w:r>
         <w:rPr>
           <w:lang w:eastAsia="zh-CN"/>
@@ -4555,7 +4726,7 @@
       <w:bookmarkStart w:id="60" w:name="_Toc233967803"/>
       <w:bookmarkStart w:id="61" w:name="_Toc233968979"/>
       <w:bookmarkStart w:id="62" w:name="_Toc233969130"/>
-      <w:bookmarkStart w:id="63" w:name="_Toc233969219"/>
+      <w:bookmarkStart w:id="63" w:name="_Toc233969484"/>
       <w:r>
         <w:rPr>
           <w:lang w:eastAsia="zh-CN"/>
@@ -4684,7 +4855,7 @@
       <w:bookmarkStart w:id="64" w:name="_Toc233967804"/>
       <w:bookmarkStart w:id="65" w:name="_Toc233968980"/>
       <w:bookmarkStart w:id="66" w:name="_Toc233969131"/>
-      <w:bookmarkStart w:id="67" w:name="_Toc233969220"/>
+      <w:bookmarkStart w:id="67" w:name="_Toc233969485"/>
       <w:r>
         <w:rPr>
           <w:lang w:eastAsia="zh-CN"/>
@@ -6773,7 +6944,7 @@
       </w:pPr>
       <w:bookmarkStart w:id="160" w:name="_Toc233969068"/>
       <w:bookmarkStart w:id="161" w:name="_Toc233969136"/>
-      <w:bookmarkStart w:id="162" w:name="_Toc233969221"/>
+      <w:bookmarkStart w:id="162" w:name="_Toc233969486"/>
       <w:r>
         <w:lastRenderedPageBreak/>
         <w:t xml:space="preserve">5.3 </w:t>
@@ -6951,7 +7122,7 @@
       <w:bookmarkStart w:id="163" w:name="_Toc233967806"/>
       <w:bookmarkStart w:id="164" w:name="_Toc233969069"/>
       <w:bookmarkStart w:id="165" w:name="_Toc233969137"/>
-      <w:bookmarkStart w:id="166" w:name="_Toc233969222"/>
+      <w:bookmarkStart w:id="166" w:name="_Toc233969487"/>
       <w:r>
         <w:rPr>
           <w:lang w:eastAsia="zh-CN"/>
@@ -7122,7 +7293,7 @@
       <w:bookmarkStart w:id="167" w:name="_Toc233967807"/>
       <w:bookmarkStart w:id="168" w:name="_Toc233969070"/>
       <w:bookmarkStart w:id="169" w:name="_Toc233969138"/>
-      <w:bookmarkStart w:id="170" w:name="_Toc233969223"/>
+      <w:bookmarkStart w:id="170" w:name="_Toc233969488"/>
       <w:r>
         <w:t>参考文献</w:t>
       </w:r>
@@ -7169,7 +7340,7 @@
       </w:r>
     </w:p>
     <w:sectPr>
-      <w:footerReference w:type="default" r:id="rId14"/>
+      <w:footerReference w:type="default" r:id="rId10"/>
       <w:pgSz w:w="11906" w:h="16838"/>
       <w:pgMar w:top="1440" w:right="1797" w:bottom="1440" w:left="1797" w:header="720" w:footer="720" w:gutter="0"/>
       <w:pgNumType w:start="1"/>
@@ -7258,16 +7429,6 @@
   <w:p>
     <w:pPr>
       <w:pStyle w:val="a7"/>
-    </w:pPr>
-  </w:p>
-</w:ftr>
-</file>
-
-<file path=word/footer4.xml><?xml version="1.0" encoding="utf-8"?>
-<w:ftr xmlns:wpc="http://schemas.microsoft.com/office/word/2010/wordprocessingCanvas" xmlns:cx="http://schemas.microsoft.com/office/drawing/2014/chartex" xmlns:cx1="http://schemas.microsoft.com/office/drawing/2015/9/8/chartex" xmlns:cx2="http://schemas.microsoft.com/office/drawing/2015/10/21/chartex" xmlns:cx3="http://schemas.microsoft.com/office/drawing/2016/5/9/chartex" xmlns:cx4="http://schemas.microsoft.com/office/drawing/2016/5/10/chartex" xmlns:cx5="http://schemas.microsoft.com/office/drawing/2016/5/11/chartex" xmlns:cx6="http://schemas.microsoft.com/office/drawing/2016/5/12/chartex" xmlns:cx7="http://schemas.microsoft.com/office/drawing/2016/5/13/chartex" xmlns:cx8="http://schemas.microsoft.com/office/drawing/2016/5/14/chartex" xmlns:mc="http://schemas.openxmlformats.org/markup-compatibility/2006" xmlns:aink="http://schemas.microsoft.com/office/drawing/2016/ink" xmlns:am3d="http://schemas.microsoft.com/office/drawing/2017/model3d" xmlns:o="urn:schemas-microsoft-com:office:office" xmlns:oel="http://schemas.microsoft.com/office/2019/extlst" xmlns:r="http://schemas.openxmlformats.org/officeDocument/2006/relationships" xmlns:m="http://schemas.openxmlformats.org/officeDocument/2006/math" xmlns:v="urn:schemas-microsoft-com:vml" xmlns:wp14="http://schemas.microsoft.com/office/word/2010/wordprocessingDrawing" xmlns:wp="http://schemas.openxmlformats.org/drawingml/2006/wordprocessingDrawing" xmlns:w10="urn:schemas-microsoft-com:office:word" xmlns:w="http://schemas.openxmlformats.org/wordprocessingml/2006/main" xmlns:w14="http://schemas.microsoft.com/office/word/2010/wordml" xmlns:w15="http://schemas.microsoft.com/office/word/2012/wordml" xmlns:w16cex="http://schemas.microsoft.com/office/word/2018/wordml/cex" xmlns:w16cid="http://schemas.microsoft.com/office/word/2016/wordml/cid" xmlns:w16="http://schemas.microsoft.com/office/word/2018/wordml" xmlns:w16sdtdh="http://schemas.microsoft.com/office/word/2020/wordml/sdtdatahash" xmlns:w16se="http://schemas.microsoft.com/office/word/2015/wordml/symex" xmlns:wpg="http://schemas.microsoft.com/office/word/2010/wordprocessingGroup" xmlns:wpi="http://schemas.microsoft.com/office/word/2010/wordprocessingInk" xmlns:wne="http://schemas.microsoft.com/office/word/2006/wordml" xmlns:wps="http://schemas.microsoft.com/office/word/2010/wordprocessingShape" mc:Ignorable="w14 w15 w16se w16cid w16 w16cex w16sdtdh wp14">
-  <w:p>
-    <w:pPr>
-      <w:pStyle w:val="a7"/>
       <w:framePr w:wrap="around" w:vAnchor="text" w:hAnchor="margin" w:xAlign="center" w:y="1"/>
       <w:rPr>
         <w:rStyle w:val="affc"/>
@@ -7337,36 +7498,6 @@
     </w:p>
   </w:footnote>
 </w:footnotes>
-</file>
-
-<file path=word/header1.xml><?xml version="1.0" encoding="utf-8"?>
-<w:hdr xmlns:wpc="http://schemas.microsoft.com/office/word/2010/wordprocessingCanvas" xmlns:cx="http://schemas.microsoft.com/office/drawing/2014/chartex" xmlns:cx1="http://schemas.microsoft.com/office/drawing/2015/9/8/chartex" xmlns:cx2="http://schemas.microsoft.com/office/drawing/2015/10/21/chartex" xmlns:cx3="http://schemas.microsoft.com/office/drawing/2016/5/9/chartex" xmlns:cx4="http://schemas.microsoft.com/office/drawing/2016/5/10/chartex" xmlns:cx5="http://schemas.microsoft.com/office/drawing/2016/5/11/chartex" xmlns:cx6="http://schemas.microsoft.com/office/drawing/2016/5/12/chartex" xmlns:cx7="http://schemas.microsoft.com/office/drawing/2016/5/13/chartex" xmlns:cx8="http://schemas.microsoft.com/office/drawing/2016/5/14/chartex" xmlns:mc="http://schemas.openxmlformats.org/markup-compatibility/2006" xmlns:aink="http://schemas.microsoft.com/office/drawing/2016/ink" xmlns:am3d="http://schemas.microsoft.com/office/drawing/2017/model3d" xmlns:o="urn:schemas-microsoft-com:office:office" xmlns:oel="http://schemas.microsoft.com/office/2019/extlst" xmlns:r="http://schemas.openxmlformats.org/officeDocument/2006/relationships" xmlns:m="http://schemas.openxmlformats.org/officeDocument/2006/math" xmlns:v="urn:schemas-microsoft-com:vml" xmlns:wp14="http://schemas.microsoft.com/office/word/2010/wordprocessingDrawing" xmlns:wp="http://schemas.openxmlformats.org/drawingml/2006/wordprocessingDrawing" xmlns:w10="urn:schemas-microsoft-com:office:word" xmlns:w="http://schemas.openxmlformats.org/wordprocessingml/2006/main" xmlns:w14="http://schemas.microsoft.com/office/word/2010/wordml" xmlns:w15="http://schemas.microsoft.com/office/word/2012/wordml" xmlns:w16cex="http://schemas.microsoft.com/office/word/2018/wordml/cex" xmlns:w16cid="http://schemas.microsoft.com/office/word/2016/wordml/cid" xmlns:w16="http://schemas.microsoft.com/office/word/2018/wordml" xmlns:w16sdtdh="http://schemas.microsoft.com/office/word/2020/wordml/sdtdatahash" xmlns:w16se="http://schemas.microsoft.com/office/word/2015/wordml/symex" xmlns:wpg="http://schemas.microsoft.com/office/word/2010/wordprocessingGroup" xmlns:wpi="http://schemas.microsoft.com/office/word/2010/wordprocessingInk" xmlns:wne="http://schemas.microsoft.com/office/word/2006/wordml" xmlns:wps="http://schemas.microsoft.com/office/word/2010/wordprocessingShape" mc:Ignorable="w14 w15 w16se w16cid w16 w16cex w16sdtdh wp14">
-  <w:p>
-    <w:pPr>
-      <w:pStyle w:val="a5"/>
-    </w:pPr>
-  </w:p>
-</w:hdr>
-</file>
-
-<file path=word/header2.xml><?xml version="1.0" encoding="utf-8"?>
-<w:hdr xmlns:wpc="http://schemas.microsoft.com/office/word/2010/wordprocessingCanvas" xmlns:cx="http://schemas.microsoft.com/office/drawing/2014/chartex" xmlns:cx1="http://schemas.microsoft.com/office/drawing/2015/9/8/chartex" xmlns:cx2="http://schemas.microsoft.com/office/drawing/2015/10/21/chartex" xmlns:cx3="http://schemas.microsoft.com/office/drawing/2016/5/9/chartex" xmlns:cx4="http://schemas.microsoft.com/office/drawing/2016/5/10/chartex" xmlns:cx5="http://schemas.microsoft.com/office/drawing/2016/5/11/chartex" xmlns:cx6="http://schemas.microsoft.com/office/drawing/2016/5/12/chartex" xmlns:cx7="http://schemas.microsoft.com/office/drawing/2016/5/13/chartex" xmlns:cx8="http://schemas.microsoft.com/office/drawing/2016/5/14/chartex" xmlns:mc="http://schemas.openxmlformats.org/markup-compatibility/2006" xmlns:aink="http://schemas.microsoft.com/office/drawing/2016/ink" xmlns:am3d="http://schemas.microsoft.com/office/drawing/2017/model3d" xmlns:o="urn:schemas-microsoft-com:office:office" xmlns:oel="http://schemas.microsoft.com/office/2019/extlst" xmlns:r="http://schemas.openxmlformats.org/officeDocument/2006/relationships" xmlns:m="http://schemas.openxmlformats.org/officeDocument/2006/math" xmlns:v="urn:schemas-microsoft-com:vml" xmlns:wp14="http://schemas.microsoft.com/office/word/2010/wordprocessingDrawing" xmlns:wp="http://schemas.openxmlformats.org/drawingml/2006/wordprocessingDrawing" xmlns:w10="urn:schemas-microsoft-com:office:word" xmlns:w="http://schemas.openxmlformats.org/wordprocessingml/2006/main" xmlns:w14="http://schemas.microsoft.com/office/word/2010/wordml" xmlns:w15="http://schemas.microsoft.com/office/word/2012/wordml" xmlns:w16cex="http://schemas.microsoft.com/office/word/2018/wordml/cex" xmlns:w16cid="http://schemas.microsoft.com/office/word/2016/wordml/cid" xmlns:w16="http://schemas.microsoft.com/office/word/2018/wordml" xmlns:w16sdtdh="http://schemas.microsoft.com/office/word/2020/wordml/sdtdatahash" xmlns:w16se="http://schemas.microsoft.com/office/word/2015/wordml/symex" xmlns:wpg="http://schemas.microsoft.com/office/word/2010/wordprocessingGroup" xmlns:wpi="http://schemas.microsoft.com/office/word/2010/wordprocessingInk" xmlns:wne="http://schemas.microsoft.com/office/word/2006/wordml" xmlns:wps="http://schemas.microsoft.com/office/word/2010/wordprocessingShape" mc:Ignorable="w14 w15 w16se w16cid w16 w16cex w16sdtdh wp14">
-  <w:p>
-    <w:pPr>
-      <w:pStyle w:val="a5"/>
-    </w:pPr>
-  </w:p>
-</w:hdr>
-</file>
-
-<file path=word/header3.xml><?xml version="1.0" encoding="utf-8"?>
-<w:hdr xmlns:wpc="http://schemas.microsoft.com/office/word/2010/wordprocessingCanvas" xmlns:cx="http://schemas.microsoft.com/office/drawing/2014/chartex" xmlns:cx1="http://schemas.microsoft.com/office/drawing/2015/9/8/chartex" xmlns:cx2="http://schemas.microsoft.com/office/drawing/2015/10/21/chartex" xmlns:cx3="http://schemas.microsoft.com/office/drawing/2016/5/9/chartex" xmlns:cx4="http://schemas.microsoft.com/office/drawing/2016/5/10/chartex" xmlns:cx5="http://schemas.microsoft.com/office/drawing/2016/5/11/chartex" xmlns:cx6="http://schemas.microsoft.com/office/drawing/2016/5/12/chartex" xmlns:cx7="http://schemas.microsoft.com/office/drawing/2016/5/13/chartex" xmlns:cx8="http://schemas.microsoft.com/office/drawing/2016/5/14/chartex" xmlns:mc="http://schemas.openxmlformats.org/markup-compatibility/2006" xmlns:aink="http://schemas.microsoft.com/office/drawing/2016/ink" xmlns:am3d="http://schemas.microsoft.com/office/drawing/2017/model3d" xmlns:o="urn:schemas-microsoft-com:office:office" xmlns:oel="http://schemas.microsoft.com/office/2019/extlst" xmlns:r="http://schemas.openxmlformats.org/officeDocument/2006/relationships" xmlns:m="http://schemas.openxmlformats.org/officeDocument/2006/math" xmlns:v="urn:schemas-microsoft-com:vml" xmlns:wp14="http://schemas.microsoft.com/office/word/2010/wordprocessingDrawing" xmlns:wp="http://schemas.openxmlformats.org/drawingml/2006/wordprocessingDrawing" xmlns:w10="urn:schemas-microsoft-com:office:word" xmlns:w="http://schemas.openxmlformats.org/wordprocessingml/2006/main" xmlns:w14="http://schemas.microsoft.com/office/word/2010/wordml" xmlns:w15="http://schemas.microsoft.com/office/word/2012/wordml" xmlns:w16cex="http://schemas.microsoft.com/office/word/2018/wordml/cex" xmlns:w16cid="http://schemas.microsoft.com/office/word/2016/wordml/cid" xmlns:w16="http://schemas.microsoft.com/office/word/2018/wordml" xmlns:w16sdtdh="http://schemas.microsoft.com/office/word/2020/wordml/sdtdatahash" xmlns:w16se="http://schemas.microsoft.com/office/word/2015/wordml/symex" xmlns:wpg="http://schemas.microsoft.com/office/word/2010/wordprocessingGroup" xmlns:wpi="http://schemas.microsoft.com/office/word/2010/wordprocessingInk" xmlns:wne="http://schemas.microsoft.com/office/word/2006/wordml" xmlns:wps="http://schemas.microsoft.com/office/word/2010/wordprocessingShape" mc:Ignorable="w14 w15 w16se w16cid w16 w16cex w16sdtdh wp14">
-  <w:p>
-    <w:pPr>
-      <w:pStyle w:val="a5"/>
-    </w:pPr>
-  </w:p>
-</w:hdr>
 </file>
 
 <file path=word/numbering.xml><?xml version="1.0" encoding="utf-8"?>
@@ -7985,7 +8116,7 @@
       <w:rFonts w:eastAsia="黑体" w:hAnsiTheme="majorHAnsi" w:cstheme="majorBidi"/>
       <w:b/>
       <w:bCs/>
-      <w:color w:val="365F91" w:themeColor="accent1" w:themeShade="BF"/>
+      <w:color w:val="000000"/>
       <w:sz w:val="36"/>
       <w:szCs w:val="28"/>
     </w:rPr>
@@ -8009,7 +8140,7 @@
       <w:rFonts w:eastAsia="黑体" w:hAnsiTheme="majorHAnsi" w:cstheme="majorBidi"/>
       <w:b/>
       <w:bCs/>
-      <w:color w:val="4F81BD" w:themeColor="accent1"/>
+      <w:color w:val="000000"/>
       <w:sz w:val="28"/>
       <w:szCs w:val="26"/>
     </w:rPr>
@@ -8033,7 +8164,7 @@
       <w:rFonts w:eastAsia="黑体" w:hAnsiTheme="majorHAnsi" w:cstheme="majorBidi"/>
       <w:b/>
       <w:bCs/>
-      <w:color w:val="4F81BD" w:themeColor="accent1"/>
+      <w:color w:val="000000"/>
     </w:rPr>
   </w:style>
   <w:style w:type="paragraph" w:styleId="4">
@@ -8266,7 +8397,7 @@
       <w:rFonts w:ascii="Times New Roman" w:eastAsia="黑体" w:hAnsiTheme="majorHAnsi" w:cstheme="majorBidi"/>
       <w:b/>
       <w:bCs/>
-      <w:color w:val="365F91" w:themeColor="accent1" w:themeShade="BF"/>
+      <w:color w:val="000000"/>
       <w:sz w:val="36"/>
       <w:szCs w:val="28"/>
     </w:rPr>
@@ -8281,7 +8412,7 @@
       <w:rFonts w:ascii="Times New Roman" w:eastAsia="黑体" w:hAnsiTheme="majorHAnsi" w:cstheme="majorBidi"/>
       <w:b/>
       <w:bCs/>
-      <w:color w:val="4F81BD" w:themeColor="accent1"/>
+      <w:color w:val="000000"/>
       <w:sz w:val="28"/>
       <w:szCs w:val="26"/>
     </w:rPr>
@@ -8296,7 +8427,7 @@
       <w:rFonts w:ascii="Times New Roman" w:eastAsia="黑体" w:hAnsiTheme="majorHAnsi" w:cstheme="majorBidi"/>
       <w:b/>
       <w:bCs/>
-      <w:color w:val="4F81BD" w:themeColor="accent1"/>
+      <w:color w:val="000000"/>
       <w:sz w:val="24"/>
     </w:rPr>
   </w:style>

</xml_diff>